<commit_message>
Duits verwijderd als taal uit website en cv
</commit_message>
<xml_diff>
--- a/cv/Tobias_Kool_CV.docx
+++ b/cv/Tobias_Kool_CV.docx
@@ -1496,27 +1496,6 @@
                 <w:rtl w:val="0"/>
               </w:rPr>
               <w:t xml:space="preserve">Engels: Vloeiend</w:t>
-            </w:r>
-            <w:r>
-              <w:rPr>
-                <w:rtl w:val="0"/>
-              </w:rPr>
-            </w:r>
-          </w:p>
-          <w:p>
-            <w:pPr>
-              <w:spacing w:after="40" w:before="40" w:lineRule="auto"/>
-              <w:rPr/>
-            </w:pPr>
-            <w:r>
-              <w:rPr>
-                <w:rFonts w:ascii="Calibri" w:cs="Calibri" w:eastAsia="Calibri" w:hAnsi="Calibri"/>
-                <w:color w:val="555555"/>
-                <w:sz w:val="18"/>
-                <w:szCs w:val="18"/>
-                <w:rtl w:val="0"/>
-              </w:rPr>
-              <w:t xml:space="preserve">Duits: Basis</w:t>
             </w:r>
             <w:r>
               <w:rPr>

</xml_diff>